<commit_message>
Detection/ArmB article: add author-blind + proportionality principles (Nanda credited) from framework paper; rebuild Word copy
</commit_message>
<xml_diff>
--- a/research/Detection_ArmB_Article_Draft.docx
+++ b/research/Detection_ArmB_Article_Draft.docx
@@ -745,6 +745,66 @@
       <w:r>
         <w:rPr>
           <w:rFonts w:ascii="Georgia" w:cs="Georgia" w:eastAsia="Georgia" w:hAnsi="Georgia"/>
+          <w:b/>
+          <w:bCs/>
+          <w:i w:val="false"/>
+          <w:iCs w:val="false"/>
+          <w:sz w:val="22"/>
+          <w:szCs w:val="22"/>
+        </w:rPr>
+        <w:t xml:space="preserve">Author-blind by design.</w:t>
+      </w:r>
+      <w:r>
+        <w:rPr>
+          <w:rFonts w:ascii="Georgia" w:cs="Georgia" w:eastAsia="Georgia" w:hAnsi="Georgia"/>
+          <w:b w:val="false"/>
+          <w:bCs w:val="false"/>
+          <w:i w:val="false"/>
+          <w:iCs w:val="false"/>
+          <w:sz w:val="22"/>
+          <w:szCs w:val="22"/>
+        </w:rPr>
+        <w:t xml:space="preserve"> JRS does not ask, and does not try to detect, whether a record was written by a person or with AI assistance. That distinction is both technically unreliable and beside the point: a human-authored record can be conclusory and unanchored, and an AI-assisted record can be fully traceable. What the standard tests is whether the reasoning survives separation from whoever produced it. This is what keeps the criterion durable as drafting tools change, and it is why the method targets documentation risk rather than authorship.</w:t>
+      </w:r>
+    </w:p>
+    <w:p>
+      <w:pPr>
+        <w:spacing w:after="140" w:line="300"/>
+        <w:jc w:val="left"/>
+      </w:pPr>
+      <w:r>
+        <w:rPr>
+          <w:rFonts w:ascii="Georgia" w:cs="Georgia" w:eastAsia="Georgia" w:hAnsi="Georgia"/>
+          <w:b/>
+          <w:bCs/>
+          <w:i w:val="false"/>
+          <w:iCs w:val="false"/>
+          <w:sz w:val="22"/>
+          <w:szCs w:val="22"/>
+        </w:rPr>
+        <w:t xml:space="preserve">Proportionality.</w:t>
+      </w:r>
+      <w:r>
+        <w:rPr>
+          <w:rFonts w:ascii="Georgia" w:cs="Georgia" w:eastAsia="Georgia" w:hAnsi="Georgia"/>
+          <w:b w:val="false"/>
+          <w:bCs w:val="false"/>
+          <w:i w:val="false"/>
+          <w:iCs w:val="false"/>
+          <w:sz w:val="22"/>
+          <w:szCs w:val="22"/>
+        </w:rPr>
+        <w:t xml:space="preserve"> The documentation defensibility a record must carry scales with the stakes of the decision it supports: the tolerable level of Decision Reconstruction Risk falls as the consequence of the decision rises. A routine, low-stakes action may be adequately served by a brief summary, while a termination, a compliance escalation, or a benefits denial requires specific, identifiable evidence, or at least references to where that evidence resides. This principle, surfaced by pilot reviewer Saurabh Nanda, keeps the standard practical by concentrating review effort where exposure is greatest; the constructed corpus used here is deliberately weighted toward high-stakes contexts in which reconstructability matters most.</w:t>
+      </w:r>
+    </w:p>
+    <w:p>
+      <w:pPr>
+        <w:spacing w:after="140" w:line="300"/>
+        <w:jc w:val="left"/>
+      </w:pPr>
+      <w:r>
+        <w:rPr>
+          <w:rFonts w:ascii="Georgia" w:cs="Georgia" w:eastAsia="Georgia" w:hAnsi="Georgia"/>
           <w:b w:val="false"/>
           <w:bCs w:val="false"/>
           <w:i w:val="false"/>
@@ -1622,7 +1682,7 @@
           <w:sz w:val="22"/>
           <w:szCs w:val="22"/>
         </w:rPr>
-        <w:t xml:space="preserve">I thank the international reviewer panel for their care and independent judgment. Reviewers are recognized as named contributors with their consent; they are not co-authors of this paper.</w:t>
+        <w:t xml:space="preserve">I thank the international reviewer panel for their care and independent judgment. Reviewers are recognized as named contributors with their consent; they are not co-authors of this paper. The proportionality principle described in Section 3 was surfaced by pilot reviewer Saurabh Nanda, General Manager and APAC Business Leader (Align Technology), and is credited with his permission.</w:t>
       </w:r>
     </w:p>
     <w:p>

</xml_diff>